<commit_message>
feat: implement YOLOv8 AI object anonymizer for automatic face and vehicle license plate blurring
</commit_message>
<xml_diff>
--- a/awaaz_ai_technical_operational_documentation.docx
+++ b/awaaz_ai_technical_operational_documentation.docx
@@ -472,7 +472,7 @@
               <w:rPr>
                 <w:color w:val="0F172A"/>
               </w:rPr>
-              <w:t>Privacy &amp; PII Protection</w:t>
+              <w:t>Privacy Shield &amp; Object Blur</w:t>
             </w:r>
           </w:p>
         </w:tc>
@@ -486,7 +486,7 @@
               <w:rPr>
                 <w:color w:val="0F172A"/>
               </w:rPr>
-              <w:t>Regex Privacy Shield Engine</w:t>
+              <w:t>YOLOv8 Computer Vision + Regex Engine</w:t>
             </w:r>
           </w:p>
         </w:tc>
@@ -500,7 +500,7 @@
               <w:rPr>
                 <w:color w:val="0F172A"/>
               </w:rPr>
-              <w:t>client/src/components/PrivacyShield.jsx, server/controllers/complaintController.js</w:t>
+              <w:t>client/src/utils/imageAnonymizer.js, client/src/components/ImageUpload.jsx</w:t>
             </w:r>
           </w:p>
         </w:tc>
@@ -514,7 +514,7 @@
               <w:rPr>
                 <w:color w:val="0F172A"/>
               </w:rPr>
-              <w:t>Automatically detects and redacts Aadhaar numbers, phone numbers, and sensitive PII before database storage.</w:t>
+              <w:t>Auto-detects and blurs human faces &amp; vehicle license plates on evidence photos. Redacts Aadhaar &amp; phone numbers.</w:t>
             </w:r>
           </w:p>
         </w:tc>
@@ -528,7 +528,7 @@
               <w:rPr>
                 <w:color w:val="0F172A"/>
               </w:rPr>
-              <w:t>DPDP Act Compliance &amp; Data Anonymization</w:t>
+              <w:t>DPDP Act 2023 Compliant • Automatic PII Anonymization</w:t>
             </w:r>
           </w:p>
         </w:tc>

</xml_diff>

<commit_message>
feat: implement Omni-Channel SMS text message helpline intake webhook and interactive simulator
</commit_message>
<xml_diff>
--- a/awaaz_ai_technical_operational_documentation.docx
+++ b/awaaz_ai_technical_operational_documentation.docx
@@ -1749,7 +1749,7 @@
               <w:rPr>
                 <w:color w:val="0F172A"/>
               </w:rPr>
-              <w:t>GET</w:t>
+              <w:t>POST</w:t>
             </w:r>
           </w:p>
         </w:tc>
@@ -1763,7 +1763,7 @@
               <w:rPr>
                 <w:color w:val="0F172A"/>
               </w:rPr>
-              <w:t>/api/complaints/:id</w:t>
+              <w:t>/api/complaints/sms-webhook</w:t>
             </w:r>
           </w:p>
         </w:tc>
@@ -1777,6 +1777,64 @@
               <w:rPr>
                 <w:color w:val="0F172A"/>
               </w:rPr>
+              <w:t>From, Body (Text Message)</w:t>
+            </w:r>
+          </w:p>
+        </w:tc>
+        <w:tc>
+          <w:tcPr>
+            <w:tcW w:type="dxa" w:w="3312"/>
+            <w:shd w:fill="F0FDF4"/>
+          </w:tcPr>
+          <w:p>
+            <w:r>
+              <w:rPr>
+                <w:color w:val="0F172A"/>
+              </w:rPr>
+              <w:t>Omni-channel SMS Helpline webhook (+91 98765 43210). Auto-classifies text and sends SMS tracking confirmation.</w:t>
+            </w:r>
+          </w:p>
+        </w:tc>
+      </w:tr>
+      <w:tr>
+        <w:tc>
+          <w:tcPr>
+            <w:tcW w:type="dxa" w:w="1728"/>
+            <w:shd w:fill="FFFFFF"/>
+          </w:tcPr>
+          <w:p>
+            <w:r>
+              <w:rPr>
+                <w:color w:val="0F172A"/>
+              </w:rPr>
+              <w:t>GET</w:t>
+            </w:r>
+          </w:p>
+        </w:tc>
+        <w:tc>
+          <w:tcPr>
+            <w:tcW w:type="dxa" w:w="2880"/>
+            <w:shd w:fill="FFFFFF"/>
+          </w:tcPr>
+          <w:p>
+            <w:r>
+              <w:rPr>
+                <w:color w:val="0F172A"/>
+              </w:rPr>
+              <w:t>/api/complaints/:id</w:t>
+            </w:r>
+          </w:p>
+        </w:tc>
+        <w:tc>
+          <w:tcPr>
+            <w:tcW w:type="dxa" w:w="2880"/>
+            <w:shd w:fill="FFFFFF"/>
+          </w:tcPr>
+          <w:p>
+            <w:r>
+              <w:rPr>
+                <w:color w:val="0F172A"/>
+              </w:rPr>
               <w:t>None</w:t>
             </w:r>
           </w:p>
@@ -1784,7 +1842,7 @@
         <w:tc>
           <w:tcPr>
             <w:tcW w:type="dxa" w:w="3312"/>
-            <w:shd w:fill="F0FDF4"/>
+            <w:shd w:fill="FFFFFF"/>
           </w:tcPr>
           <w:p>
             <w:r>
@@ -1800,7 +1858,7 @@
         <w:tc>
           <w:tcPr>
             <w:tcW w:type="dxa" w:w="1728"/>
-            <w:shd w:fill="FFFFFF"/>
+            <w:shd w:fill="F0FDF4"/>
           </w:tcPr>
           <w:p>
             <w:r>
@@ -1814,7 +1872,7 @@
         <w:tc>
           <w:tcPr>
             <w:tcW w:type="dxa" w:w="2880"/>
-            <w:shd w:fill="FFFFFF"/>
+            <w:shd w:fill="F0FDF4"/>
           </w:tcPr>
           <w:p>
             <w:r>
@@ -1828,7 +1886,7 @@
         <w:tc>
           <w:tcPr>
             <w:tcW w:type="dxa" w:w="2880"/>
-            <w:shd w:fill="FFFFFF"/>
+            <w:shd w:fill="F0FDF4"/>
           </w:tcPr>
           <w:p>
             <w:r>
@@ -1842,6 +1900,22 @@
         <w:tc>
           <w:tcPr>
             <w:tcW w:type="dxa" w:w="3312"/>
+            <w:shd w:fill="F0FDF4"/>
+          </w:tcPr>
+          <w:p>
+            <w:r>
+              <w:rPr>
+                <w:color w:val="0F172A"/>
+              </w:rPr>
+              <w:t>Updates status. Triggers photo proof requirement for Pending Verification.</w:t>
+            </w:r>
+          </w:p>
+        </w:tc>
+      </w:tr>
+      <w:tr>
+        <w:tc>
+          <w:tcPr>
+            <w:tcW w:type="dxa" w:w="1728"/>
             <w:shd w:fill="FFFFFF"/>
           </w:tcPr>
           <w:p>
@@ -1849,7 +1923,49 @@
               <w:rPr>
                 <w:color w:val="0F172A"/>
               </w:rPr>
-              <w:t>Updates status. Triggers photo proof requirement for Pending Verification.</w:t>
+              <w:t>POST</w:t>
+            </w:r>
+          </w:p>
+        </w:tc>
+        <w:tc>
+          <w:tcPr>
+            <w:tcW w:type="dxa" w:w="2880"/>
+            <w:shd w:fill="FFFFFF"/>
+          </w:tcPr>
+          <w:p>
+            <w:r>
+              <w:rPr>
+                <w:color w:val="0F172A"/>
+              </w:rPr>
+              <w:t>/api/complaints/:id/verify</w:t>
+            </w:r>
+          </w:p>
+        </w:tc>
+        <w:tc>
+          <w:tcPr>
+            <w:tcW w:type="dxa" w:w="2880"/>
+            <w:shd w:fill="FFFFFF"/>
+          </w:tcPr>
+          <w:p>
+            <w:r>
+              <w:rPr>
+                <w:color w:val="0F172A"/>
+              </w:rPr>
+              <w:t>citizenName, comment</w:t>
+            </w:r>
+          </w:p>
+        </w:tc>
+        <w:tc>
+          <w:tcPr>
+            <w:tcW w:type="dxa" w:w="3312"/>
+            <w:shd w:fill="FFFFFF"/>
+          </w:tcPr>
+          <w:p>
+            <w:r>
+              <w:rPr>
+                <w:color w:val="0F172A"/>
+              </w:rPr>
+              <w:t>Records citizen authenticity audit (1/3, 2/3, 3/3 -&gt; Verified &amp; Resolved).</w:t>
             </w:r>
           </w:p>
         </w:tc>
@@ -1879,7 +1995,7 @@
               <w:rPr>
                 <w:color w:val="0F172A"/>
               </w:rPr>
-              <w:t>/api/complaints/:id/verify</w:t>
+              <w:t>/api/auth/register</w:t>
             </w:r>
           </w:p>
         </w:tc>
@@ -1893,7 +2009,7 @@
               <w:rPr>
                 <w:color w:val="0F172A"/>
               </w:rPr>
-              <w:t>citizenName, comment</w:t>
+              <w:t>name, mobile, email, secretKey, role</w:t>
             </w:r>
           </w:p>
         </w:tc>
@@ -1907,7 +2023,7 @@
               <w:rPr>
                 <w:color w:val="0F172A"/>
               </w:rPr>
-              <w:t>Records citizen authenticity audit (1/3, 2/3, 3/3 -&gt; Verified &amp; Resolved).</w:t>
+              <w:t>Registers user. Requires OFFICER_SECRET_KEY for Officer/Admin role authorization.</w:t>
             </w:r>
           </w:p>
         </w:tc>
@@ -1937,7 +2053,7 @@
               <w:rPr>
                 <w:color w:val="0F172A"/>
               </w:rPr>
-              <w:t>/api/auth/register</w:t>
+              <w:t>/api/auth/login</w:t>
             </w:r>
           </w:p>
         </w:tc>
@@ -1951,7 +2067,7 @@
               <w:rPr>
                 <w:color w:val="0F172A"/>
               </w:rPr>
-              <w:t>name, mobile, email, secretKey, role</w:t>
+              <w:t>identifier, password</w:t>
             </w:r>
           </w:p>
         </w:tc>
@@ -1959,64 +2075,6 @@
           <w:tcPr>
             <w:tcW w:type="dxa" w:w="3312"/>
             <w:shd w:fill="FFFFFF"/>
-          </w:tcPr>
-          <w:p>
-            <w:r>
-              <w:rPr>
-                <w:color w:val="0F172A"/>
-              </w:rPr>
-              <w:t>Registers user. Requires OFFICER_SECRET_KEY for Officer/Admin role authorization.</w:t>
-            </w:r>
-          </w:p>
-        </w:tc>
-      </w:tr>
-      <w:tr>
-        <w:tc>
-          <w:tcPr>
-            <w:tcW w:type="dxa" w:w="1728"/>
-            <w:shd w:fill="F0FDF4"/>
-          </w:tcPr>
-          <w:p>
-            <w:r>
-              <w:rPr>
-                <w:color w:val="0F172A"/>
-              </w:rPr>
-              <w:t>POST</w:t>
-            </w:r>
-          </w:p>
-        </w:tc>
-        <w:tc>
-          <w:tcPr>
-            <w:tcW w:type="dxa" w:w="2880"/>
-            <w:shd w:fill="F0FDF4"/>
-          </w:tcPr>
-          <w:p>
-            <w:r>
-              <w:rPr>
-                <w:color w:val="0F172A"/>
-              </w:rPr>
-              <w:t>/api/auth/login</w:t>
-            </w:r>
-          </w:p>
-        </w:tc>
-        <w:tc>
-          <w:tcPr>
-            <w:tcW w:type="dxa" w:w="2880"/>
-            <w:shd w:fill="F0FDF4"/>
-          </w:tcPr>
-          <w:p>
-            <w:r>
-              <w:rPr>
-                <w:color w:val="0F172A"/>
-              </w:rPr>
-              <w:t>identifier, password</w:t>
-            </w:r>
-          </w:p>
-        </w:tc>
-        <w:tc>
-          <w:tcPr>
-            <w:tcW w:type="dxa" w:w="3312"/>
-            <w:shd w:fill="F0FDF4"/>
           </w:tcPr>
           <w:p>
             <w:r>

</xml_diff>